<commit_message>
Rename Standard plan to Basic and Advanced to Standard across content exhibits and templates
- Update seed-templates.cjs and seed-exhibits.cjs metadata (name, planType, description, keywords)

- Rewrite tier text inside 65 affected backend-exhibits/*.docx files

- Add 4 new google-mydrive-sharedrive-to-microsoft-onedrive-sharepoint exhibit variants

- Fix multi-combination display name in QuoteGenerator: use exhibit name instead of title-cased combo key (e.g. 'Dropbox to Google Shared Drive' instead of 'Dropbox To Google')

- Add src/config/recipientDirectory.ts for auto-filling recipient name/title from email in Place Fields

- E-sign UX: clickable Start here jumps to first unfilled field; sticky Edit/Submit/Download action bar pinned to viewport bottom

- Add .gitignore entries for local backups, customer uploads, Claude Code worktrees, and one-shot maintenance scripts
</commit_message>
<xml_diff>
--- a/backend-exhibits/DropBox for Business to Google SharedDrive Advanced Plan - Advanced Include.docx
+++ b/backend-exhibits/DropBox for Business to Google SharedDrive Advanced Plan - Advanced Include.docx
@@ -52,7 +52,7 @@
                 <w:color w:val="000000"/>
                 <w:szCs w:val="21"/>
               </w:rPr>
-              <w:t>Advanced Plan Features (Dropbox to Google Shared Drive)</w:t>
+              <w:t>Standard Plan Features (Dropbox to Google Shared Drive)</w:t>
             </w:r>
           </w:p>
         </w:tc>
@@ -1153,7 +1153,7 @@
                 <w:color w:val="000000"/>
                 <w:szCs w:val="21"/>
               </w:rPr>
-              <w:t>Advanced Plan Fe</w:t>
+              <w:t>Standard Plan Fe</w:t>
             </w:r>
           </w:p>
         </w:tc>

</xml_diff>